<commit_message>
feat: add TPP document template and test artifacts for mailmerge functionality
</commit_message>
<xml_diff>
--- a/files/TEMPLATE_TPP.docx
+++ b/files/TEMPLATE_TPP.docx
@@ -1,6 +1,6 @@
 
 <file path=word/document.xml><?xml version="1.0" encoding="utf-8"?>
-<w:document xmlns:wpc="http://schemas.microsoft.com/office/word/2010/wordprocessingCanvas" xmlns:cx="http://schemas.microsoft.com/office/drawing/2014/chartex" xmlns:cx1="http://schemas.microsoft.com/office/drawing/2015/9/8/chartex" xmlns:cx2="http://schemas.microsoft.com/office/drawing/2015/10/21/chartex" xmlns:cx3="http://schemas.microsoft.com/office/drawing/2016/5/9/chartex" xmlns:cx4="http://schemas.microsoft.com/office/drawing/2016/5/10/chartex" xmlns:cx5="http://schemas.microsoft.com/office/drawing/2016/5/11/chartex" xmlns:cx6="http://schemas.microsoft.com/office/drawing/2016/5/12/chartex" xmlns:cx7="http://schemas.microsoft.com/office/drawing/2016/5/13/chartex" xmlns:cx8="http://schemas.microsoft.com/office/drawing/2016/5/14/chartex" xmlns:mc="http://schemas.openxmlformats.org/markup-compatibility/2006" xmlns:aink="http://schemas.microsoft.com/office/drawing/2016/ink" xmlns:am3d="http://schemas.microsoft.com/office/drawing/2017/model3d" xmlns:o="urn:schemas-microsoft-com:office:office" xmlns:oel="http://schemas.microsoft.com/office/2019/extlst" xmlns:r="http://schemas.openxmlformats.org/officeDocument/2006/relationships" xmlns:m="http://schemas.openxmlformats.org/officeDocument/2006/math" xmlns:v="urn:schemas-microsoft-com:vml" xmlns:wp14="http://schemas.microsoft.com/office/word/2010/wordprocessingDrawing" xmlns:wp="http://schemas.openxmlformats.org/drawingml/2006/wordprocessingDrawing" xmlns:w10="urn:schemas-microsoft-com:office:word" xmlns:w="http://schemas.openxmlformats.org/wordprocessingml/2006/main" xmlns:w14="http://schemas.microsoft.com/office/word/2010/wordml" xmlns:w15="http://schemas.microsoft.com/office/word/2012/wordml" xmlns:w16cei="http://schemas.microsoft.com/office/word/2026/wordml/cei" xmlns:w16cex="http://schemas.microsoft.com/office/word/2018/wordml/cex" xmlns:w16cid="http://schemas.microsoft.com/office/word/2016/wordml/cid" xmlns:w16="http://schemas.microsoft.com/office/word/2018/wordml" xmlns:w16du="http://schemas.microsoft.com/office/word/2023/wordml/word16du" xmlns:w16sdtdh="http://schemas.microsoft.com/office/word/2020/wordml/sdtdatahash" xmlns:w16sdtfl="http://schemas.microsoft.com/office/word/2024/wordml/sdtformatlock" xmlns:w16se="http://schemas.microsoft.com/office/word/2015/wordml/symex" xmlns:wpg="http://schemas.microsoft.com/office/word/2010/wordprocessingGroup" xmlns:wpi="http://schemas.microsoft.com/office/word/2010/wordprocessingInk" xmlns:wne="http://schemas.microsoft.com/office/word/2006/wordml" xmlns:wps="http://schemas.microsoft.com/office/word/2010/wordprocessingShape" mc:Ignorable="w14 w15 w16se w16cid w16 w16cex w16sdtdh w16sdtfl w16du wp14">
+<w:document xmlns:wpc="http://schemas.microsoft.com/office/word/2010/wordprocessingCanvas" xmlns:cx="http://schemas.microsoft.com/office/drawing/2014/chartex" xmlns:cx1="http://schemas.microsoft.com/office/drawing/2015/9/8/chartex" xmlns:cx2="http://schemas.microsoft.com/office/drawing/2015/10/21/chartex" xmlns:cx3="http://schemas.microsoft.com/office/drawing/2016/5/9/chartex" xmlns:cx4="http://schemas.microsoft.com/office/drawing/2016/5/10/chartex" xmlns:cx5="http://schemas.microsoft.com/office/drawing/2016/5/11/chartex" xmlns:cx6="http://schemas.microsoft.com/office/drawing/2016/5/12/chartex" xmlns:cx7="http://schemas.microsoft.com/office/drawing/2016/5/13/chartex" xmlns:cx8="http://schemas.microsoft.com/office/drawing/2016/5/14/chartex" xmlns:mc="http://schemas.openxmlformats.org/markup-compatibility/2006" xmlns:aink="http://schemas.microsoft.com/office/drawing/2016/ink" xmlns:am3d="http://schemas.microsoft.com/office/drawing/2017/model3d" xmlns:o="urn:schemas-microsoft-com:office:office" xmlns:oel="http://schemas.microsoft.com/office/2019/extlst" xmlns:r="http://schemas.openxmlformats.org/officeDocument/2006/relationships" xmlns:m="http://schemas.openxmlformats.org/officeDocument/2006/math" xmlns:v="urn:schemas-microsoft-com:vml" xmlns:wp14="http://schemas.microsoft.com/office/word/2010/wordprocessingDrawing" xmlns:wp="http://schemas.openxmlformats.org/drawingml/2006/wordprocessingDrawing" xmlns:w10="urn:schemas-microsoft-com:office:word" xmlns:w="http://schemas.openxmlformats.org/wordprocessingml/2006/main" xmlns:w14="http://schemas.microsoft.com/office/word/2010/wordml" xmlns:w15="http://schemas.microsoft.com/office/word/2012/wordml" xmlns:w16cex="http://schemas.microsoft.com/office/word/2018/wordml/cex" xmlns:w16cid="http://schemas.microsoft.com/office/word/2016/wordml/cid" xmlns:w16="http://schemas.microsoft.com/office/word/2018/wordml" xmlns:w16du="http://schemas.microsoft.com/office/word/2023/wordml/word16du" xmlns:w16sdtdh="http://schemas.microsoft.com/office/word/2020/wordml/sdtdatahash" xmlns:w16sdtfl="http://schemas.microsoft.com/office/word/2024/wordml/sdtformatlock" xmlns:w16se="http://schemas.microsoft.com/office/word/2015/wordml/symex" xmlns:wpg="http://schemas.microsoft.com/office/word/2010/wordprocessingGroup" xmlns:wpi="http://schemas.microsoft.com/office/word/2010/wordprocessingInk" xmlns:wne="http://schemas.microsoft.com/office/word/2006/wordml" xmlns:wps="http://schemas.microsoft.com/office/word/2010/wordprocessingShape" mc:Ignorable="w14 w15 w16se w16cid w16 w16cex w16sdtdh w16sdtfl w16du wp14">
   <w:body>
     <w:p>
       <w:pPr>
@@ -1009,12 +1009,6 @@
               <w:rPr>
                 <w:rFonts w:ascii="Arial" w:hAnsi="Arial" w:cs="Arial"/>
               </w:rPr>
-              <w:instrText/>
-            </w:r>
-            <w:r>
-              <w:rPr>
-                <w:rFonts w:ascii="Arial" w:hAnsi="Arial" w:cs="Arial"/>
-              </w:rPr>
               <w:fldChar w:fldCharType="separate"/>
             </w:r>
             <w:r>
@@ -1066,12 +1060,6 @@
               <w:rPr>
                 <w:rFonts w:ascii="Arial" w:hAnsi="Arial" w:cs="Arial"/>
               </w:rPr>
-              <w:instrText/>
-            </w:r>
-            <w:r>
-              <w:rPr>
-                <w:rFonts w:ascii="Arial" w:hAnsi="Arial" w:cs="Arial"/>
-              </w:rPr>
               <w:fldChar w:fldCharType="separate"/>
             </w:r>
             <w:r>
@@ -1117,19 +1105,7 @@
               <w:rPr>
                 <w:rFonts w:ascii="Arial" w:hAnsi="Arial" w:cs="Arial"/>
               </w:rPr>
-              <w:instrText xml:space="preserve"> MERGEFIELD TMK_Persen</w:instrText>
-            </w:r>
-            <w:r>
-              <w:rPr>
-                <w:rFonts w:ascii="Arial" w:hAnsi="Arial" w:cs="Arial"/>
-              </w:rPr>
-              <w:instrText/>
-            </w:r>
-            <w:r>
-              <w:rPr>
-                <w:rFonts w:ascii="Arial" w:hAnsi="Arial" w:cs="Arial"/>
-              </w:rPr>
-              <w:instrText xml:space="preserve"> </w:instrText>
+              <w:instrText xml:space="preserve"> MERGEFIELD TMK_Persen </w:instrText>
             </w:r>
             <w:r>
               <w:rPr>
@@ -1186,12 +1162,6 @@
               <w:rPr>
                 <w:rFonts w:ascii="Arial" w:hAnsi="Arial" w:cs="Arial"/>
               </w:rPr>
-              <w:instrText/>
-            </w:r>
-            <w:r>
-              <w:rPr>
-                <w:rFonts w:ascii="Arial" w:hAnsi="Arial" w:cs="Arial"/>
-              </w:rPr>
               <w:fldChar w:fldCharType="separate"/>
             </w:r>
             <w:r>
@@ -1246,12 +1216,6 @@
                 <w:lang w:val="sv-SE"/>
               </w:rPr>
               <w:instrText xml:space="preserve"> MERGEFIELD jumlah_TP </w:instrText>
-            </w:r>
-            <w:r>
-              <w:rPr>
-                <w:rFonts w:ascii="Arial" w:hAnsi="Arial" w:cs="Arial"/>
-              </w:rPr>
-              <w:instrText/>
             </w:r>
             <w:r>
               <w:rPr>
@@ -5372,7 +5336,6 @@
               <w:t xml:space="preserve"> % </w:t>
             </w:r>
             <w:proofErr w:type="spellStart"/>
-            <w:proofErr w:type="gramStart"/>
             <w:r>
               <w:rPr>
                 <w:rFonts w:ascii="Arial" w:eastAsia="Times New Roman" w:hAnsi="Arial" w:cs="Arial"/>
@@ -5422,20 +5385,7 @@
                 <w:lang w:eastAsia="en-ID"/>
                 <w14:ligatures w14:val="none"/>
               </w:rPr>
-              <w:t xml:space="preserve">)   </w:t>
-            </w:r>
-            <w:proofErr w:type="gramEnd"/>
-            <w:r>
-              <w:rPr>
-                <w:rFonts w:ascii="Arial" w:eastAsia="Times New Roman" w:hAnsi="Arial" w:cs="Arial"/>
-                <w:b/>
-                <w:bCs/>
-                <w:color w:val="000000"/>
-                <w:kern w:val="0"/>
-                <w:lang w:eastAsia="en-ID"/>
-                <w14:ligatures w14:val="none"/>
-              </w:rPr>
-              <w:t xml:space="preserve">                   </w:t>
+              <w:t xml:space="preserve">)                      </w:t>
             </w:r>
           </w:p>
         </w:tc>
@@ -6206,7 +6156,7 @@
         <w:ind w:left="4678"/>
         <w:rPr>
           <w:rFonts w:ascii="Arial" w:hAnsi="Arial" w:cs="Arial"/>
-          <w:lang w:val="en-US"/>
+          <w:lang w:val="pt-BR"/>
         </w:rPr>
       </w:pPr>
       <w:r>
@@ -6219,7 +6169,7 @@
       <w:r>
         <w:rPr>
           <w:rFonts w:ascii="Arial" w:hAnsi="Arial" w:cs="Arial"/>
-          <w:lang w:val="en-US"/>
+          <w:lang w:val="pt-BR"/>
         </w:rPr>
         <w:instrText xml:space="preserve"> MERGEFIELD NAMA_PIMPINAN </w:instrText>
       </w:r>
@@ -6234,7 +6184,7 @@
         <w:rPr>
           <w:rFonts w:ascii="Arial" w:hAnsi="Arial" w:cs="Arial"/>
           <w:noProof/>
-          <w:lang w:val="en-US"/>
+          <w:lang w:val="pt-BR"/>
         </w:rPr>
         <w:t>Ir LINGGA SAKTI DAMAYANTI S.Hut., M.M</w:t>
       </w:r>
@@ -7856,7 +7806,7 @@
             <w:pPr>
               <w:rPr>
                 <w:rFonts w:ascii="Arial" w:hAnsi="Arial" w:cs="Arial"/>
-                <w:lang w:val="en-US"/>
+                <w:lang w:val="pt-BR"/>
               </w:rPr>
             </w:pPr>
             <w:r>
@@ -8069,12 +8019,6 @@
               <w:rPr>
                 <w:rFonts w:ascii="Arial" w:hAnsi="Arial" w:cs="Arial"/>
               </w:rPr>
-              <w:instrText/>
-            </w:r>
-            <w:r>
-              <w:rPr>
-                <w:rFonts w:ascii="Arial" w:hAnsi="Arial" w:cs="Arial"/>
-              </w:rPr>
               <w:fldChar w:fldCharType="separate"/>
             </w:r>
             <w:r>
@@ -8920,12 +8864,6 @@
             <w:r>
               <w:rPr>
                 <w:rFonts w:ascii="Arial" w:hAnsi="Arial" w:cs="Arial"/>
-              </w:rPr>
-              <w:instrText/>
-            </w:r>
-            <w:r>
-              <w:rPr>
-                <w:rFonts w:ascii="Arial" w:hAnsi="Arial" w:cs="Arial"/>
                 <w:lang w:val="en-US"/>
               </w:rPr>
               <w:fldChar w:fldCharType="separate"/>
@@ -9208,12 +9146,6 @@
             <w:r>
               <w:rPr>
                 <w:rFonts w:ascii="Arial" w:hAnsi="Arial" w:cs="Arial"/>
-              </w:rPr>
-              <w:instrText/>
-            </w:r>
-            <w:r>
-              <w:rPr>
-                <w:rFonts w:ascii="Arial" w:hAnsi="Arial" w:cs="Arial"/>
                 <w:lang w:val="en-US"/>
               </w:rPr>
               <w:fldChar w:fldCharType="separate"/>
@@ -9345,12 +9277,6 @@
             <w:r>
               <w:rPr>
                 <w:rFonts w:ascii="Arial" w:hAnsi="Arial" w:cs="Arial"/>
-              </w:rPr>
-              <w:instrText/>
-            </w:r>
-            <w:r>
-              <w:rPr>
-                <w:rFonts w:ascii="Arial" w:hAnsi="Arial" w:cs="Arial"/>
                 <w:lang w:val="en-US"/>
               </w:rPr>
               <w:fldChar w:fldCharType="separate"/>
@@ -9389,12 +9315,6 @@
                 <w:lang w:val="en-US"/>
               </w:rPr>
               <w:instrText xml:space="preserve"> MERGEFIELD TPP_Asli </w:instrText>
-            </w:r>
-            <w:r>
-              <w:rPr>
-                <w:rFonts w:ascii="Arial" w:hAnsi="Arial" w:cs="Arial"/>
-              </w:rPr>
-              <w:instrText/>
             </w:r>
             <w:r>
               <w:rPr>
@@ -9480,12 +9400,6 @@
                 <w:lang w:val="en-US"/>
               </w:rPr>
               <w:instrText xml:space="preserve"> MERGEFIELD jumlah_TP </w:instrText>
-            </w:r>
-            <w:r>
-              <w:rPr>
-                <w:rFonts w:ascii="Arial" w:hAnsi="Arial" w:cs="Arial"/>
-              </w:rPr>
-              <w:instrText/>
             </w:r>
             <w:r>
               <w:rPr>
@@ -9806,12 +9720,6 @@
             <w:r>
               <w:rPr>
                 <w:rFonts w:ascii="Arial" w:hAnsi="Arial" w:cs="Arial"/>
-              </w:rPr>
-              <w:instrText/>
-            </w:r>
-            <w:r>
-              <w:rPr>
-                <w:rFonts w:ascii="Arial" w:hAnsi="Arial" w:cs="Arial"/>
                 <w:lang w:val="en-US"/>
               </w:rPr>
               <w:fldChar w:fldCharType="separate"/>
@@ -9969,12 +9877,6 @@
             <w:r>
               <w:rPr>
                 <w:rFonts w:ascii="Arial" w:hAnsi="Arial" w:cs="Arial"/>
-              </w:rPr>
-              <w:instrText/>
-            </w:r>
-            <w:r>
-              <w:rPr>
-                <w:rFonts w:ascii="Arial" w:hAnsi="Arial" w:cs="Arial"/>
                 <w:lang w:val="en-US"/>
               </w:rPr>
               <w:fldChar w:fldCharType="separate"/>
@@ -10109,12 +10011,6 @@
             <w:r>
               <w:rPr>
                 <w:rFonts w:ascii="Arial" w:hAnsi="Arial" w:cs="Arial"/>
-              </w:rPr>
-              <w:instrText/>
-            </w:r>
-            <w:r>
-              <w:rPr>
-                <w:rFonts w:ascii="Arial" w:hAnsi="Arial" w:cs="Arial"/>
                 <w:lang w:val="en-US"/>
               </w:rPr>
               <w:fldChar w:fldCharType="separate"/>
@@ -10249,12 +10145,6 @@
             <w:r>
               <w:rPr>
                 <w:rFonts w:ascii="Arial" w:hAnsi="Arial" w:cs="Arial"/>
-              </w:rPr>
-              <w:instrText/>
-            </w:r>
-            <w:r>
-              <w:rPr>
-                <w:rFonts w:ascii="Arial" w:hAnsi="Arial" w:cs="Arial"/>
                 <w:lang w:val="en-US"/>
               </w:rPr>
               <w:fldChar w:fldCharType="separate"/>
@@ -10377,12 +10267,6 @@
                 <w:lang w:val="en-US"/>
               </w:rPr>
               <w:instrText xml:space="preserve"> MERGEFIELD TPP_bersih </w:instrText>
-            </w:r>
-            <w:r>
-              <w:rPr>
-                <w:rFonts w:ascii="Arial" w:hAnsi="Arial" w:cs="Arial"/>
-              </w:rPr>
-              <w:instrText/>
             </w:r>
             <w:r>
               <w:rPr>
@@ -10558,7 +10442,7 @@
         <w:ind w:left="4678"/>
         <w:rPr>
           <w:rFonts w:ascii="Arial" w:hAnsi="Arial" w:cs="Arial"/>
-          <w:lang w:val="en-US"/>
+          <w:lang w:val="pt-BR"/>
         </w:rPr>
       </w:pPr>
       <w:r>
@@ -10571,7 +10455,7 @@
       <w:r>
         <w:rPr>
           <w:rFonts w:ascii="Arial" w:hAnsi="Arial" w:cs="Arial"/>
-          <w:lang w:val="en-US"/>
+          <w:lang w:val="pt-BR"/>
         </w:rPr>
         <w:instrText xml:space="preserve"> MERGEFIELD NAMA_PIMPINAN </w:instrText>
       </w:r>
@@ -10586,7 +10470,7 @@
         <w:rPr>
           <w:rFonts w:ascii="Arial" w:hAnsi="Arial" w:cs="Arial"/>
           <w:noProof/>
-          <w:lang w:val="en-US"/>
+          <w:lang w:val="pt-BR"/>
         </w:rPr>
         <w:t>Ir LINGGA SAKTI DAMAYANTI S.Hut., M.M</w:t>
       </w:r>
@@ -10653,12 +10537,62 @@
     </w:p>
     <w:sectPr>
       <w:pgSz w:w="11906" w:h="16838"/>
-      <w:pgMar w:top="993" w:right="1440" w:bottom="426" w:left="1440" w:header="708" w:footer="708" w:gutter="0"/>
+      <w:pgMar w:top="993" w:right="1440" w:bottom="426" w:left="1440" w:header="708" w:footer="0" w:gutter="0"/>
       <w:cols w:space="708"/>
       <w:docGrid w:linePitch="360"/>
     </w:sectPr>
   </w:body>
 </w:document>
+</file>
+
+<file path=word/endnotes.xml><?xml version="1.0" encoding="utf-8"?>
+<w:endnotes xmlns:wpc="http://schemas.microsoft.com/office/word/2010/wordprocessingCanvas" xmlns:cx="http://schemas.microsoft.com/office/drawing/2014/chartex" xmlns:cx1="http://schemas.microsoft.com/office/drawing/2015/9/8/chartex" xmlns:cx2="http://schemas.microsoft.com/office/drawing/2015/10/21/chartex" xmlns:cx3="http://schemas.microsoft.com/office/drawing/2016/5/9/chartex" xmlns:cx4="http://schemas.microsoft.com/office/drawing/2016/5/10/chartex" xmlns:cx5="http://schemas.microsoft.com/office/drawing/2016/5/11/chartex" xmlns:cx6="http://schemas.microsoft.com/office/drawing/2016/5/12/chartex" xmlns:cx7="http://schemas.microsoft.com/office/drawing/2016/5/13/chartex" xmlns:cx8="http://schemas.microsoft.com/office/drawing/2016/5/14/chartex" xmlns:mc="http://schemas.openxmlformats.org/markup-compatibility/2006" xmlns:aink="http://schemas.microsoft.com/office/drawing/2016/ink" xmlns:am3d="http://schemas.microsoft.com/office/drawing/2017/model3d" xmlns:o="urn:schemas-microsoft-com:office:office" xmlns:oel="http://schemas.microsoft.com/office/2019/extlst" xmlns:r="http://schemas.openxmlformats.org/officeDocument/2006/relationships" xmlns:m="http://schemas.openxmlformats.org/officeDocument/2006/math" xmlns:v="urn:schemas-microsoft-com:vml" xmlns:wp14="http://schemas.microsoft.com/office/word/2010/wordprocessingDrawing" xmlns:wp="http://schemas.openxmlformats.org/drawingml/2006/wordprocessingDrawing" xmlns:w10="urn:schemas-microsoft-com:office:word" xmlns:w="http://schemas.openxmlformats.org/wordprocessingml/2006/main" xmlns:w14="http://schemas.microsoft.com/office/word/2010/wordml" xmlns:w15="http://schemas.microsoft.com/office/word/2012/wordml" xmlns:w16cex="http://schemas.microsoft.com/office/word/2018/wordml/cex" xmlns:w16cid="http://schemas.microsoft.com/office/word/2016/wordml/cid" xmlns:w16="http://schemas.microsoft.com/office/word/2018/wordml" xmlns:w16du="http://schemas.microsoft.com/office/word/2023/wordml/word16du" xmlns:w16sdtdh="http://schemas.microsoft.com/office/word/2020/wordml/sdtdatahash" xmlns:w16sdtfl="http://schemas.microsoft.com/office/word/2024/wordml/sdtformatlock" xmlns:w16se="http://schemas.microsoft.com/office/word/2015/wordml/symex" xmlns:wpg="http://schemas.microsoft.com/office/word/2010/wordprocessingGroup" xmlns:wpi="http://schemas.microsoft.com/office/word/2010/wordprocessingInk" xmlns:wne="http://schemas.microsoft.com/office/word/2006/wordml" xmlns:wps="http://schemas.microsoft.com/office/word/2010/wordprocessingShape" mc:Ignorable="w14 w15 w16se w16cid w16 w16cex w16sdtdh w16sdtfl w16du wp14">
+  <w:endnote w:type="separator" w:id="-1">
+    <w:p>
+      <w:pPr>
+        <w:spacing w:after="0" w:line="240" w:lineRule="auto"/>
+      </w:pPr>
+      <w:r>
+        <w:separator/>
+      </w:r>
+    </w:p>
+  </w:endnote>
+  <w:endnote w:type="continuationSeparator" w:id="0">
+    <w:p>
+      <w:pPr>
+        <w:spacing w:after="0" w:line="240" w:lineRule="auto"/>
+      </w:pPr>
+      <w:r>
+        <w:continuationSeparator/>
+      </w:r>
+    </w:p>
+  </w:endnote>
+</w:endnotes>
+</file>
+
+<file path=word/footnotes.xml><?xml version="1.0" encoding="utf-8"?>
+<w:footnotes xmlns:wpc="http://schemas.microsoft.com/office/word/2010/wordprocessingCanvas" xmlns:cx="http://schemas.microsoft.com/office/drawing/2014/chartex" xmlns:cx1="http://schemas.microsoft.com/office/drawing/2015/9/8/chartex" xmlns:cx2="http://schemas.microsoft.com/office/drawing/2015/10/21/chartex" xmlns:cx3="http://schemas.microsoft.com/office/drawing/2016/5/9/chartex" xmlns:cx4="http://schemas.microsoft.com/office/drawing/2016/5/10/chartex" xmlns:cx5="http://schemas.microsoft.com/office/drawing/2016/5/11/chartex" xmlns:cx6="http://schemas.microsoft.com/office/drawing/2016/5/12/chartex" xmlns:cx7="http://schemas.microsoft.com/office/drawing/2016/5/13/chartex" xmlns:cx8="http://schemas.microsoft.com/office/drawing/2016/5/14/chartex" xmlns:mc="http://schemas.openxmlformats.org/markup-compatibility/2006" xmlns:aink="http://schemas.microsoft.com/office/drawing/2016/ink" xmlns:am3d="http://schemas.microsoft.com/office/drawing/2017/model3d" xmlns:o="urn:schemas-microsoft-com:office:office" xmlns:oel="http://schemas.microsoft.com/office/2019/extlst" xmlns:r="http://schemas.openxmlformats.org/officeDocument/2006/relationships" xmlns:m="http://schemas.openxmlformats.org/officeDocument/2006/math" xmlns:v="urn:schemas-microsoft-com:vml" xmlns:wp14="http://schemas.microsoft.com/office/word/2010/wordprocessingDrawing" xmlns:wp="http://schemas.openxmlformats.org/drawingml/2006/wordprocessingDrawing" xmlns:w10="urn:schemas-microsoft-com:office:word" xmlns:w="http://schemas.openxmlformats.org/wordprocessingml/2006/main" xmlns:w14="http://schemas.microsoft.com/office/word/2010/wordml" xmlns:w15="http://schemas.microsoft.com/office/word/2012/wordml" xmlns:w16cex="http://schemas.microsoft.com/office/word/2018/wordml/cex" xmlns:w16cid="http://schemas.microsoft.com/office/word/2016/wordml/cid" xmlns:w16="http://schemas.microsoft.com/office/word/2018/wordml" xmlns:w16du="http://schemas.microsoft.com/office/word/2023/wordml/word16du" xmlns:w16sdtdh="http://schemas.microsoft.com/office/word/2020/wordml/sdtdatahash" xmlns:w16sdtfl="http://schemas.microsoft.com/office/word/2024/wordml/sdtformatlock" xmlns:w16se="http://schemas.microsoft.com/office/word/2015/wordml/symex" xmlns:wpg="http://schemas.microsoft.com/office/word/2010/wordprocessingGroup" xmlns:wpi="http://schemas.microsoft.com/office/word/2010/wordprocessingInk" xmlns:wne="http://schemas.microsoft.com/office/word/2006/wordml" xmlns:wps="http://schemas.microsoft.com/office/word/2010/wordprocessingShape" mc:Ignorable="w14 w15 w16se w16cid w16 w16cex w16sdtdh w16sdtfl w16du wp14">
+  <w:footnote w:type="separator" w:id="-1">
+    <w:p>
+      <w:pPr>
+        <w:spacing w:after="0" w:line="240" w:lineRule="auto"/>
+      </w:pPr>
+      <w:r>
+        <w:separator/>
+      </w:r>
+    </w:p>
+  </w:footnote>
+  <w:footnote w:type="continuationSeparator" w:id="0">
+    <w:p>
+      <w:pPr>
+        <w:spacing w:after="0" w:line="240" w:lineRule="auto"/>
+      </w:pPr>
+      <w:r>
+        <w:continuationSeparator/>
+      </w:r>
+    </w:p>
+  </w:footnote>
+</w:footnotes>
 </file>
 
 <file path=word/styles.xml><?xml version="1.0" encoding="utf-8"?>
@@ -11120,6 +11054,50 @@
       <w:contextualSpacing/>
     </w:pPr>
   </w:style>
+  <w:style w:type="paragraph" w:styleId="Header">
+    <w:name w:val="header"/>
+    <w:basedOn w:val="Normal"/>
+    <w:link w:val="HeaderChar"/>
+    <w:uiPriority w:val="99"/>
+    <w:unhideWhenUsed/>
+    <w:rsid w:val="00B25BC9"/>
+    <w:pPr>
+      <w:tabs>
+        <w:tab w:val="center" w:pos="4513"/>
+        <w:tab w:val="right" w:pos="9026"/>
+      </w:tabs>
+      <w:spacing w:after="0" w:line="240" w:lineRule="auto"/>
+    </w:pPr>
+  </w:style>
+  <w:style w:type="character" w:customStyle="1" w:styleId="HeaderChar">
+    <w:name w:val="Header Char"/>
+    <w:basedOn w:val="DefaultParagraphFont"/>
+    <w:link w:val="Header"/>
+    <w:uiPriority w:val="99"/>
+    <w:rsid w:val="00B25BC9"/>
+  </w:style>
+  <w:style w:type="paragraph" w:styleId="Footer">
+    <w:name w:val="footer"/>
+    <w:basedOn w:val="Normal"/>
+    <w:link w:val="FooterChar"/>
+    <w:uiPriority w:val="99"/>
+    <w:unhideWhenUsed/>
+    <w:rsid w:val="00B25BC9"/>
+    <w:pPr>
+      <w:tabs>
+        <w:tab w:val="center" w:pos="4513"/>
+        <w:tab w:val="right" w:pos="9026"/>
+      </w:tabs>
+      <w:spacing w:after="0" w:line="240" w:lineRule="auto"/>
+    </w:pPr>
+  </w:style>
+  <w:style w:type="character" w:customStyle="1" w:styleId="FooterChar">
+    <w:name w:val="Footer Char"/>
+    <w:basedOn w:val="DefaultParagraphFont"/>
+    <w:link w:val="Footer"/>
+    <w:uiPriority w:val="99"/>
+    <w:rsid w:val="00B25BC9"/>
+  </w:style>
 </w:styles>
 </file>
 

</xml_diff>

<commit_message>
feat: add PDF splitting step for signed leadership documents and update release build configuration
</commit_message>
<xml_diff>
--- a/files/TEMPLATE_TPP.docx
+++ b/files/TEMPLATE_TPP.docx
@@ -7081,131 +7081,57 @@
         </w:tc>
       </w:tr>
       <w:tr>
+        <w:trPr>
+          <w:trHeight w:val="279"/>
+        </w:trPr>
         <w:tc>
           <w:tcPr>
             <w:tcW w:w="547" w:type="dxa"/>
-          </w:tcPr>
-          <w:p>
-            <w:pPr>
-              <w:jc w:val="center"/>
-              <w:rPr>
-                <w:rFonts w:ascii="Arial" w:hAnsi="Arial" w:cs="Arial"/>
-                <w:sz w:val="20"/>
-                <w:szCs w:val="20"/>
-                <w:lang w:val="en-US"/>
-              </w:rPr>
-            </w:pPr>
-            <w:r>
-              <w:rPr>
-                <w:rFonts w:ascii="Arial" w:hAnsi="Arial" w:cs="Arial"/>
-                <w:sz w:val="20"/>
-                <w:szCs w:val="20"/>
-                <w:lang w:val="en-US"/>
-              </w:rPr>
-              <w:t>1</w:t>
-            </w:r>
-          </w:p>
-        </w:tc>
-        <w:tc>
-          <w:tcPr>
-            <w:tcW w:w="3208" w:type="dxa"/>
-            <w:gridSpan w:val="3"/>
-          </w:tcPr>
-          <w:p>
-            <w:pPr>
-              <w:jc w:val="center"/>
-              <w:rPr>
-                <w:rFonts w:ascii="Arial" w:hAnsi="Arial" w:cs="Arial"/>
-                <w:sz w:val="20"/>
-                <w:szCs w:val="20"/>
-                <w:lang w:val="en-US"/>
-              </w:rPr>
-            </w:pPr>
-            <w:r>
-              <w:rPr>
-                <w:rFonts w:ascii="Arial" w:hAnsi="Arial" w:cs="Arial"/>
-                <w:sz w:val="20"/>
-                <w:szCs w:val="20"/>
-                <w:lang w:val="en-US"/>
-              </w:rPr>
-              <w:t>2</w:t>
-            </w:r>
-          </w:p>
-        </w:tc>
-        <w:tc>
-          <w:tcPr>
-            <w:tcW w:w="1506" w:type="dxa"/>
-            <w:gridSpan w:val="3"/>
-          </w:tcPr>
-          <w:p>
-            <w:pPr>
-              <w:jc w:val="center"/>
-              <w:rPr>
-                <w:rFonts w:ascii="Arial" w:hAnsi="Arial" w:cs="Arial"/>
-                <w:sz w:val="20"/>
-                <w:szCs w:val="20"/>
-                <w:lang w:val="en-US"/>
-              </w:rPr>
-            </w:pPr>
-            <w:r>
-              <w:rPr>
-                <w:rFonts w:ascii="Arial" w:hAnsi="Arial" w:cs="Arial"/>
-                <w:sz w:val="20"/>
-                <w:szCs w:val="20"/>
-                <w:lang w:val="en-US"/>
-              </w:rPr>
-              <w:t>3</w:t>
-            </w:r>
-          </w:p>
-        </w:tc>
-        <w:tc>
-          <w:tcPr>
-            <w:tcW w:w="1793" w:type="dxa"/>
-          </w:tcPr>
-          <w:p>
-            <w:pPr>
-              <w:jc w:val="center"/>
-              <w:rPr>
-                <w:rFonts w:ascii="Arial" w:hAnsi="Arial" w:cs="Arial"/>
-                <w:sz w:val="20"/>
-                <w:szCs w:val="20"/>
-                <w:lang w:val="en-US"/>
-              </w:rPr>
-            </w:pPr>
-            <w:r>
-              <w:rPr>
-                <w:rFonts w:ascii="Arial" w:hAnsi="Arial" w:cs="Arial"/>
-                <w:sz w:val="20"/>
-                <w:szCs w:val="20"/>
-                <w:lang w:val="en-US"/>
-              </w:rPr>
-              <w:t>4</w:t>
-            </w:r>
-          </w:p>
-        </w:tc>
-        <w:tc>
-          <w:tcPr>
-            <w:tcW w:w="2297" w:type="dxa"/>
-            <w:gridSpan w:val="2"/>
-          </w:tcPr>
-          <w:p>
-            <w:pPr>
-              <w:jc w:val="center"/>
-              <w:rPr>
-                <w:rFonts w:ascii="Arial" w:hAnsi="Arial" w:cs="Arial"/>
-                <w:sz w:val="20"/>
-                <w:szCs w:val="20"/>
-                <w:lang w:val="en-US"/>
-              </w:rPr>
-            </w:pPr>
-            <w:r>
-              <w:rPr>
-                <w:rFonts w:ascii="Arial" w:hAnsi="Arial" w:cs="Arial"/>
-                <w:sz w:val="20"/>
-                <w:szCs w:val="20"/>
-                <w:lang w:val="en-US"/>
-              </w:rPr>
-              <w:t>5</w:t>
+            <w:vAlign w:val="center"/>
+          </w:tcPr>
+          <w:p>
+            <w:pPr>
+              <w:rPr>
+                <w:rFonts w:ascii="Arial" w:hAnsi="Arial" w:cs="Arial"/>
+                <w:b/>
+                <w:bCs/>
+                <w:lang w:val="en-US"/>
+              </w:rPr>
+            </w:pPr>
+            <w:r>
+              <w:rPr>
+                <w:rFonts w:ascii="Arial" w:hAnsi="Arial" w:cs="Arial"/>
+                <w:b/>
+                <w:bCs/>
+                <w:lang w:val="en-US"/>
+              </w:rPr>
+              <w:t>I</w:t>
+            </w:r>
+          </w:p>
+        </w:tc>
+        <w:tc>
+          <w:tcPr>
+            <w:tcW w:w="8804" w:type="dxa"/>
+            <w:gridSpan w:val="9"/>
+            <w:vAlign w:val="center"/>
+          </w:tcPr>
+          <w:p>
+            <w:pPr>
+              <w:rPr>
+                <w:rFonts w:ascii="Arial" w:hAnsi="Arial" w:cs="Arial"/>
+                <w:b/>
+                <w:bCs/>
+                <w:lang w:val="en-US"/>
+              </w:rPr>
+            </w:pPr>
+            <w:r>
+              <w:rPr>
+                <w:rFonts w:ascii="Arial" w:hAnsi="Arial" w:cs="Arial"/>
+                <w:b/>
+                <w:bCs/>
+                <w:lang w:val="en-US"/>
+              </w:rPr>
+              <w:t>Tingkat Kehadiran (40%)</w:t>
             </w:r>
           </w:p>
         </w:tc>
@@ -7217,62 +7143,6 @@
         <w:tc>
           <w:tcPr>
             <w:tcW w:w="547" w:type="dxa"/>
-            <w:vAlign w:val="center"/>
-          </w:tcPr>
-          <w:p>
-            <w:pPr>
-              <w:rPr>
-                <w:rFonts w:ascii="Arial" w:hAnsi="Arial" w:cs="Arial"/>
-                <w:b/>
-                <w:bCs/>
-                <w:lang w:val="en-US"/>
-              </w:rPr>
-            </w:pPr>
-            <w:r>
-              <w:rPr>
-                <w:rFonts w:ascii="Arial" w:hAnsi="Arial" w:cs="Arial"/>
-                <w:b/>
-                <w:bCs/>
-                <w:lang w:val="en-US"/>
-              </w:rPr>
-              <w:t>I</w:t>
-            </w:r>
-          </w:p>
-        </w:tc>
-        <w:tc>
-          <w:tcPr>
-            <w:tcW w:w="8804" w:type="dxa"/>
-            <w:gridSpan w:val="9"/>
-            <w:vAlign w:val="center"/>
-          </w:tcPr>
-          <w:p>
-            <w:pPr>
-              <w:rPr>
-                <w:rFonts w:ascii="Arial" w:hAnsi="Arial" w:cs="Arial"/>
-                <w:b/>
-                <w:bCs/>
-                <w:lang w:val="en-US"/>
-              </w:rPr>
-            </w:pPr>
-            <w:r>
-              <w:rPr>
-                <w:rFonts w:ascii="Arial" w:hAnsi="Arial" w:cs="Arial"/>
-                <w:b/>
-                <w:bCs/>
-                <w:lang w:val="en-US"/>
-              </w:rPr>
-              <w:t>Tingkat Kehadiran (40%)</w:t>
-            </w:r>
-          </w:p>
-        </w:tc>
-      </w:tr>
-      <w:tr>
-        <w:trPr>
-          <w:trHeight w:val="454"/>
-        </w:trPr>
-        <w:tc>
-          <w:tcPr>
-            <w:tcW w:w="547" w:type="dxa"/>
           </w:tcPr>
           <w:p>
             <w:pPr>
@@ -8045,7 +7915,7 @@
       </w:tr>
       <w:tr>
         <w:trPr>
-          <w:trHeight w:val="454"/>
+          <w:trHeight w:val="355"/>
         </w:trPr>
         <w:tc>
           <w:tcPr>

</xml_diff>